<commit_message>
Fjern fed skrift fra enkeltord i brødteksten i 14 vejledninger
Fremhævede ord og sætninger i løbende tekst er nu almindelig tekst
(fx «inden», «densitet», «Skålene må ikke åbnes»). Fed skrift er beholdt,
hvor den er en etiket og ikke en fremhævning: knap- og menunavne (TARE,
MiljøGIS-lagene), koder eleverne skal skrive (+/−, H/L, A/B/D),
udfyldningsfelter, tabeloverskrifter og indledende etiketter i
listepunkter (Methylenblåt:, Gør klar., Fejlkilder.).

Alle 14 er renderet igen til PDF, Word og HTML. De gamle HTML-filer havde
en indlejret ES6-polyfill fra den nedlagte polyfill-tjeneste med; den
falder væk ved ny rendering, som i de øvrige vejledninger.

Co-Authored-By: Claude Opus 5.5 <noreply@anthropic.com>
Claude-Session: https://claude.ai/code/session_017ZZDVYGdt2eCg6b74LUvcs
</commit_message>
<xml_diff>
--- a/Øvelser/Biologi/bakterier-og-svampe/bakterier-og-svampe.docx
+++ b/Øvelser/Biologi/bakterier-og-svampe/bakterier-og-svampe.docx
@@ -391,23 +391,7 @@
         </w:numPr>
       </w:pPr>
       <w:r>
-        <w:t xml:space="preserve">Tag skålene ud af varmeskabet.</w:t>
-      </w:r>
-      <w:r>
-        <w:t xml:space="preserve"> </w:t>
-      </w:r>
-      <w:r>
-        <w:rPr>
-          <w:b/>
-          <w:bCs/>
-        </w:rPr>
-        <w:t xml:space="preserve">Skålene må ikke åbnes</w:t>
-      </w:r>
-      <w:r>
-        <w:t xml:space="preserve"> </w:t>
-      </w:r>
-      <w:r>
-        <w:t xml:space="preserve">— kolonierne skal tælles og markeres gennem det lukkede låg.</w:t>
+        <w:t xml:space="preserve">Tag skålene ud af varmeskabet. Skålene må ikke åbnes — kolonierne skal tælles og markeres gennem det lukkede låg.</w:t>
       </w:r>
     </w:p>
     <w:p>
@@ -469,7 +453,7 @@
                     <a:graphicData uri="http://schemas.openxmlformats.org/drawingml/2006/picture">
                       <pic:pic>
                         <pic:nvPicPr>
-                          <pic:cNvPr descr="/Applications/quarto/share/formats/docx/tip.png" id="25" name="Picture"/>
+                          <pic:cNvPr descr="/tmp/claude-0/-home-user-smbi/7d291b92-c289-57a9-b4b8-12c4134f11be/scratchpad/qo/quarto-1.10.18/share/formats/docx/tip.png" id="25" name="Picture"/>
                           <pic:cNvPicPr>
                             <a:picLocks noChangeArrowheads="1" noChangeAspect="1"/>
                           </pic:cNvPicPr>
@@ -649,7 +633,7 @@
                     <a:graphicData uri="http://schemas.openxmlformats.org/drawingml/2006/picture">
                       <pic:pic>
                         <pic:nvPicPr>
-                          <pic:cNvPr descr="/Applications/quarto/share/formats/docx/note.png" id="28" name="Picture"/>
+                          <pic:cNvPr descr="/tmp/claude-0/-home-user-smbi/7d291b92-c289-57a9-b4b8-12c4134f11be/scratchpad/qo/quarto-1.10.18/share/formats/docx/note.png" id="28" name="Picture"/>
                           <pic:cNvPicPr>
                             <a:picLocks noChangeArrowheads="1" noChangeAspect="1"/>
                           </pic:cNvPicPr>
@@ -859,7 +843,7 @@
                     <a:graphicData uri="http://schemas.openxmlformats.org/drawingml/2006/picture">
                       <pic:pic>
                         <pic:nvPicPr>
-                          <pic:cNvPr descr="/Applications/quarto/share/formats/docx/important.png" id="31" name="Picture"/>
+                          <pic:cNvPr descr="/tmp/claude-0/-home-user-smbi/7d291b92-c289-57a9-b4b8-12c4134f11be/scratchpad/qo/quarto-1.10.18/share/formats/docx/important.png" id="31" name="Picture"/>
                           <pic:cNvPicPr>
                             <a:picLocks noChangeArrowheads="1" noChangeAspect="1"/>
                           </pic:cNvPicPr>
@@ -935,23 +919,7 @@
               </w:numPr>
             </w:pPr>
             <w:r>
-              <w:t xml:space="preserve">Efter inkubation ved 37 °C kan pladerne indeholde mikroorganismer, som trives ved kropstemperatur, herunder eventuelle opportunistiske arter.</w:t>
-            </w:r>
-            <w:r>
-              <w:t xml:space="preserve"> </w:t>
-            </w:r>
-            <w:r>
-              <w:rPr>
-                <w:b/>
-                <w:bCs/>
-              </w:rPr>
-              <w:t xml:space="preserve">Skålene må derfor ikke åbnes</w:t>
-            </w:r>
-            <w:r>
-              <w:t xml:space="preserve"> </w:t>
-            </w:r>
-            <w:r>
-              <w:t xml:space="preserve">efter inkubation.</w:t>
+              <w:t xml:space="preserve">Efter inkubation ved 37 °C kan pladerne indeholde mikroorganismer, som trives ved kropstemperatur, herunder eventuelle opportunistiske arter. Skålene må derfor ikke åbnes efter inkubation.</w:t>
             </w:r>
           </w:p>
           <w:p>

</xml_diff>

<commit_message>
Journalspørgsmål i bakterier-og-svampe og blodsukkermåling
Bakterier og svampe: diskussionspunkterne flyttet fra Databehandling til
et eget afsnit, suppleret med originalens spørgsmål. Blodsukkermåling:
ny Databehandling (graf, stigning og areal over fasteværdien) og
journalspørgsmål. Oversigten rettet med.

Co-Authored-By: Claude Opus 5.5 <noreply@anthropic.com>
</commit_message>
<xml_diff>
--- a/Øvelser/Biologi/bakterier-og-svampe/bakterier-og-svampe.docx
+++ b/Øvelser/Biologi/bakterier-og-svampe/bakterier-og-svampe.docx
@@ -453,7 +453,7 @@
                     <a:graphicData uri="http://schemas.openxmlformats.org/drawingml/2006/picture">
                       <pic:pic>
                         <pic:nvPicPr>
-                          <pic:cNvPr descr="/tmp/claude-0/-home-user-smbi/7d291b92-c289-57a9-b4b8-12c4134f11be/scratchpad/qo/quarto-1.10.18/share/formats/docx/tip.png" id="25" name="Picture"/>
+                          <pic:cNvPr descr="/Applications/quarto/share/formats/docx/tip.png" id="25" name="Picture"/>
                           <pic:cNvPicPr>
                             <a:picLocks noChangeArrowheads="1" noChangeAspect="1"/>
                           </pic:cNvPicPr>
@@ -633,7 +633,7 @@
                     <a:graphicData uri="http://schemas.openxmlformats.org/drawingml/2006/picture">
                       <pic:pic>
                         <pic:nvPicPr>
-                          <pic:cNvPr descr="/tmp/claude-0/-home-user-smbi/7d291b92-c289-57a9-b4b8-12c4134f11be/scratchpad/qo/quarto-1.10.18/share/formats/docx/note.png" id="28" name="Picture"/>
+                          <pic:cNvPr descr="/Applications/quarto/share/formats/docx/note.png" id="28" name="Picture"/>
                           <pic:cNvPicPr>
                             <a:picLocks noChangeArrowheads="1" noChangeAspect="1"/>
                           </pic:cNvPicPr>
@@ -843,7 +843,7 @@
                     <a:graphicData uri="http://schemas.openxmlformats.org/drawingml/2006/picture">
                       <pic:pic>
                         <pic:nvPicPr>
-                          <pic:cNvPr descr="/tmp/claude-0/-home-user-smbi/7d291b92-c289-57a9-b4b8-12c4134f11be/scratchpad/qo/quarto-1.10.18/share/formats/docx/important.png" id="31" name="Picture"/>
+                          <pic:cNvPr descr="/Applications/quarto/share/formats/docx/important.png" id="31" name="Picture"/>
                           <pic:cNvPicPr>
                             <a:picLocks noChangeArrowheads="1" noChangeAspect="1"/>
                           </pic:cNvPicPr>
@@ -1963,43 +1963,17 @@
         </w:numPr>
       </w:pPr>
       <w:r>
-        <w:t xml:space="preserve">Diskutér på baggrund af resultaterne:</w:t>
-      </w:r>
-    </w:p>
-    <w:p>
-      <w:pPr>
-        <w:pStyle w:val="Compact"/>
-        <w:numPr>
-          <w:ilvl w:val="1"/>
-          <w:numId w:val="1011"/>
-        </w:numPr>
-      </w:pPr>
-      <w:r>
-        <w:t xml:space="preserve">Hvor stammer de bakterier og svampesporer, I har fundet, fra?</w:t>
-      </w:r>
-    </w:p>
-    <w:p>
-      <w:pPr>
-        <w:pStyle w:val="Compact"/>
-        <w:numPr>
-          <w:ilvl w:val="1"/>
-          <w:numId w:val="1011"/>
-        </w:numPr>
-      </w:pPr>
-      <w:r>
-        <w:t xml:space="preserve">Hvilke betingelser (temperatur, fugt, næring) skal være til stede, for at bakterier og svampe kan vokse — og hvordan har I selv skabt dem i varmeskabet?</w:t>
-      </w:r>
-    </w:p>
-    <w:p>
-      <w:pPr>
-        <w:pStyle w:val="Compact"/>
-        <w:numPr>
-          <w:ilvl w:val="1"/>
-          <w:numId w:val="1011"/>
-        </w:numPr>
-      </w:pPr>
-      <w:r>
-        <w:t xml:space="preserve">Hvordan kan I bruge jeres resultater fra felt I–IV til at give et råd om håndhygiejne?</w:t>
+        <w:t xml:space="preserve">Skriv en kort konklusion, der samler formålet og de vigtigste tal.</w:t>
+      </w:r>
+    </w:p>
+    <w:bookmarkEnd w:id="37"/>
+    <w:bookmarkStart w:id="38" w:name="journalspørgsmål"/>
+    <w:p>
+      <w:pPr>
+        <w:pStyle w:val="Heading2"/>
+      </w:pPr>
+      <w:r>
+        <w:t xml:space="preserve">Journalspørgsmål</w:t>
       </w:r>
     </w:p>
     <w:p>
@@ -2007,14 +1981,74 @@
         <w:pStyle w:val="Compact"/>
         <w:numPr>
           <w:ilvl w:val="0"/>
-          <w:numId w:val="1010"/>
+          <w:numId w:val="1011"/>
         </w:numPr>
       </w:pPr>
       <w:r>
-        <w:t xml:space="preserve">Skriv en kort konklusion, der samler formålet, de vigtigste tal og svarene på spørgsmålene ovenfor.</w:t>
-      </w:r>
-    </w:p>
-    <w:bookmarkEnd w:id="37"/>
+        <w:t xml:space="preserve">Hvordan kan en eventuel forskel mellem kimfaldet indendørs og udendørs forklares? Har placeringen af skålene indendørs betydning for resultatet?</w:t>
+      </w:r>
+    </w:p>
+    <w:p>
+      <w:pPr>
+        <w:pStyle w:val="Compact"/>
+        <w:numPr>
+          <w:ilvl w:val="0"/>
+          <w:numId w:val="1011"/>
+        </w:numPr>
+      </w:pPr>
+      <w:r>
+        <w:t xml:space="preserve">Er der forskel på antallet af bakterie- og svampekolonier? Hvordan kan I se forskel på en bakteriekoloni og en svampekoloni på pladen, og hvor mange forskellige typer af hver fandt I?</w:t>
+      </w:r>
+    </w:p>
+    <w:p>
+      <w:pPr>
+        <w:pStyle w:val="Compact"/>
+        <w:numPr>
+          <w:ilvl w:val="0"/>
+          <w:numId w:val="1011"/>
+        </w:numPr>
+      </w:pPr>
+      <w:r>
+        <w:t xml:space="preserve">Hvor stammer de bakterier og svampesporer, I har fundet, fra?</w:t>
+      </w:r>
+    </w:p>
+    <w:p>
+      <w:pPr>
+        <w:pStyle w:val="Compact"/>
+        <w:numPr>
+          <w:ilvl w:val="0"/>
+          <w:numId w:val="1011"/>
+        </w:numPr>
+      </w:pPr>
+      <w:r>
+        <w:t xml:space="preserve">Hvilke betingelser (temperatur, fugt, næring) skal være til stede, for at bakterier og svampe kan vokse — og hvordan har I selv skabt dem i varmeskabet? Hvorfor bruges der forskellig agar til bakterier og svampe?</w:t>
+      </w:r>
+    </w:p>
+    <w:p>
+      <w:pPr>
+        <w:pStyle w:val="Compact"/>
+        <w:numPr>
+          <w:ilvl w:val="0"/>
+          <w:numId w:val="1011"/>
+        </w:numPr>
+      </w:pPr>
+      <w:r>
+        <w:t xml:space="preserve">Hvordan kan I bruge jeres resultater fra felt I–IV til at give et råd om håndhygiejne?</w:t>
+      </w:r>
+    </w:p>
+    <w:p>
+      <w:pPr>
+        <w:pStyle w:val="Compact"/>
+        <w:numPr>
+          <w:ilvl w:val="0"/>
+          <w:numId w:val="1011"/>
+        </w:numPr>
+      </w:pPr>
+      <w:r>
+        <w:t xml:space="preserve">Hvordan fjerner eller dræber vi bakterier, og hvordan undgår vi at få bakterier og skimmelsvampe i maden?</w:t>
+      </w:r>
+    </w:p>
+    <w:bookmarkEnd w:id="38"/>
     <w:sectPr>
       <w:headerReference r:id="rId7" w:type="default"/>
       <w:footerReference r:id="rId8" w:type="default"/>
@@ -2953,7 +2987,34 @@
     </w:lvlOverride>
   </w:num>
   <w:num w:numId="1011">
-    <w:abstractNumId w:val="991"/>
+    <w:abstractNumId w:val="99411"/>
+    <w:lvlOverride w:ilvl="0">
+      <w:startOverride w:val="1"/>
+    </w:lvlOverride>
+    <w:lvlOverride w:ilvl="1">
+      <w:startOverride w:val="1"/>
+    </w:lvlOverride>
+    <w:lvlOverride w:ilvl="2">
+      <w:startOverride w:val="1"/>
+    </w:lvlOverride>
+    <w:lvlOverride w:ilvl="3">
+      <w:startOverride w:val="1"/>
+    </w:lvlOverride>
+    <w:lvlOverride w:ilvl="4">
+      <w:startOverride w:val="1"/>
+    </w:lvlOverride>
+    <w:lvlOverride w:ilvl="5">
+      <w:startOverride w:val="1"/>
+    </w:lvlOverride>
+    <w:lvlOverride w:ilvl="6">
+      <w:startOverride w:val="1"/>
+    </w:lvlOverride>
+    <w:lvlOverride w:ilvl="7">
+      <w:startOverride w:val="1"/>
+    </w:lvlOverride>
+    <w:lvlOverride w:ilvl="8">
+      <w:startOverride w:val="1"/>
+    </w:lvlOverride>
   </w:num>
 </w:numbering>
 </file>

</xml_diff>